<commit_message>
Add solutions for AWII Prüfung SS2026 - Teil 2 and exam document
- Created a new markdown file containing detailed solutions for the AWII Prüfung SS2026 - Teil 2, covering various mathematical concepts and examples.
- Added a new Word document for the exam prompt related to the same examination.
</commit_message>
<xml_diff>
--- a/Tests/AngewandteMathematik/Test2/AWII_Prüfung_SS2026_Teil 2 - Angabe.docx
+++ b/Tests/AngewandteMathematik/Test2/AWII_Prüfung_SS2026_Teil 2 - Angabe.docx
@@ -2363,6 +2363,14 @@
         </w:rPr>
         <w:tab/>
       </w:r>
+      <w:r>
+        <w:rPr>
+          <w:rFonts w:ascii="Times New Roman" w:eastAsiaTheme="minorEastAsia" w:hAnsi="Times New Roman" w:cs="Times New Roman"/>
+          <w:sz w:val="24"/>
+          <w:szCs w:val="24"/>
+        </w:rPr>
+        <w:t xml:space="preserve">   </w:t>
+      </w:r>
       <w:sdt>
         <w:sdtPr>
           <w:rPr>
@@ -2391,6 +2399,14 @@
       <w:r>
         <w:rPr>
           <w:rFonts w:ascii="MS Gothic" w:eastAsia="MS Gothic" w:hAnsi="MS Gothic" w:cs="Times New Roman"/>
+          <w:sz w:val="24"/>
+          <w:szCs w:val="24"/>
+        </w:rPr>
+        <w:t xml:space="preserve"> </w:t>
+      </w:r>
+      <w:r>
+        <w:rPr>
+          <w:rFonts w:ascii="Times New Roman" w:eastAsiaTheme="minorEastAsia" w:hAnsi="Times New Roman" w:cs="Times New Roman"/>
           <w:sz w:val="24"/>
           <w:szCs w:val="24"/>
         </w:rPr>
@@ -2577,6 +2593,14 @@
         </w:rPr>
         <w:tab/>
       </w:r>
+      <w:r>
+        <w:rPr>
+          <w:rFonts w:ascii="Times New Roman" w:eastAsiaTheme="minorEastAsia" w:hAnsi="Times New Roman" w:cs="Times New Roman"/>
+          <w:sz w:val="24"/>
+          <w:szCs w:val="24"/>
+        </w:rPr>
+        <w:t xml:space="preserve">   </w:t>
+      </w:r>
       <w:sdt>
         <w:sdtPr>
           <w:rPr>
@@ -2584,7 +2608,7 @@
             <w:sz w:val="24"/>
             <w:szCs w:val="24"/>
           </w:rPr>
-          <w:id w:val="-40830885"/>
+          <w:id w:val="726652579"/>
           <w14:checkbox>
             <w14:checked w14:val="0"/>
             <w14:checkedState w14:val="2612" w14:font="MS Gothic"/>
@@ -2618,6 +2642,14 @@
         </w:rPr>
         <w:t xml:space="preserve"> </w:t>
       </w:r>
+      <w:r>
+        <w:rPr>
+          <w:rFonts w:ascii="Times New Roman" w:eastAsiaTheme="minorEastAsia" w:hAnsi="Times New Roman" w:cs="Times New Roman"/>
+          <w:sz w:val="24"/>
+          <w:szCs w:val="24"/>
+        </w:rPr>
+        <w:t xml:space="preserve"> </w:t>
+      </w:r>
       <w:sdt>
         <w:sdtPr>
           <w:rPr>
@@ -2625,7 +2657,7 @@
             <w:sz w:val="24"/>
             <w:szCs w:val="24"/>
           </w:rPr>
-          <w:id w:val="625821115"/>
+          <w:id w:val="-1955478671"/>
           <w14:checkbox>
             <w14:checked w14:val="0"/>
             <w14:checkedState w14:val="2612" w14:font="MS Gothic"/>
@@ -2729,6 +2761,14 @@
         </w:rPr>
         <w:tab/>
       </w:r>
+      <w:r>
+        <w:rPr>
+          <w:rFonts w:ascii="Times New Roman" w:eastAsiaTheme="minorEastAsia" w:hAnsi="Times New Roman" w:cs="Times New Roman"/>
+          <w:sz w:val="24"/>
+          <w:szCs w:val="24"/>
+        </w:rPr>
+        <w:t xml:space="preserve">   </w:t>
+      </w:r>
       <w:sdt>
         <w:sdtPr>
           <w:rPr>
@@ -2736,7 +2776,7 @@
             <w:sz w:val="24"/>
             <w:szCs w:val="24"/>
           </w:rPr>
-          <w:id w:val="-96253077"/>
+          <w:id w:val="-654757996"/>
           <w14:checkbox>
             <w14:checked w14:val="0"/>
             <w14:checkedState w14:val="2612" w14:font="MS Gothic"/>
@@ -2770,6 +2810,14 @@
         </w:rPr>
         <w:t xml:space="preserve"> </w:t>
       </w:r>
+      <w:r>
+        <w:rPr>
+          <w:rFonts w:ascii="Times New Roman" w:eastAsiaTheme="minorEastAsia" w:hAnsi="Times New Roman" w:cs="Times New Roman"/>
+          <w:sz w:val="24"/>
+          <w:szCs w:val="24"/>
+        </w:rPr>
+        <w:t xml:space="preserve"> </w:t>
+      </w:r>
       <w:sdt>
         <w:sdtPr>
           <w:rPr>
@@ -2777,7 +2825,7 @@
             <w:sz w:val="24"/>
             <w:szCs w:val="24"/>
           </w:rPr>
-          <w:id w:val="-1542815923"/>
+          <w:id w:val="-1812868168"/>
           <w14:checkbox>
             <w14:checked w14:val="0"/>
             <w14:checkedState w14:val="2612" w14:font="MS Gothic"/>
@@ -2873,23 +2921,7 @@
             <w:sz w:val="24"/>
             <w:szCs w:val="24"/>
           </w:rPr>
-          <m:t>(n</m:t>
-        </m:r>
-        <m:r>
-          <w:rPr>
-            <w:rFonts w:ascii="Cambria Math" w:hAnsi="Cambria Math" w:cs="Times New Roman"/>
-            <w:sz w:val="24"/>
-            <w:szCs w:val="24"/>
-          </w:rPr>
-          <m:t>-1</m:t>
-        </m:r>
-        <m:r>
-          <w:rPr>
-            <w:rFonts w:ascii="Cambria Math" w:hAnsi="Cambria Math" w:cs="Times New Roman"/>
-            <w:sz w:val="24"/>
-            <w:szCs w:val="24"/>
-          </w:rPr>
-          <m:t>)</m:t>
+          <m:t>(n-1)</m:t>
         </m:r>
       </m:oMath>
       <w:r>
@@ -2950,6 +2982,14 @@
         </w:rPr>
         <w:tab/>
       </w:r>
+      <w:r>
+        <w:rPr>
+          <w:rFonts w:ascii="Times New Roman" w:eastAsiaTheme="minorEastAsia" w:hAnsi="Times New Roman" w:cs="Times New Roman"/>
+          <w:sz w:val="24"/>
+          <w:szCs w:val="24"/>
+        </w:rPr>
+        <w:t xml:space="preserve">   </w:t>
+      </w:r>
       <w:sdt>
         <w:sdtPr>
           <w:rPr>
@@ -2957,7 +2997,7 @@
             <w:sz w:val="24"/>
             <w:szCs w:val="24"/>
           </w:rPr>
-          <w:id w:val="840356464"/>
+          <w:id w:val="1443725377"/>
           <w14:checkbox>
             <w14:checked w14:val="0"/>
             <w14:checkedState w14:val="2612" w14:font="MS Gothic"/>
@@ -2991,6 +3031,14 @@
         </w:rPr>
         <w:t xml:space="preserve"> </w:t>
       </w:r>
+      <w:r>
+        <w:rPr>
+          <w:rFonts w:ascii="Times New Roman" w:eastAsiaTheme="minorEastAsia" w:hAnsi="Times New Roman" w:cs="Times New Roman"/>
+          <w:sz w:val="24"/>
+          <w:szCs w:val="24"/>
+        </w:rPr>
+        <w:t xml:space="preserve"> </w:t>
+      </w:r>
       <w:sdt>
         <w:sdtPr>
           <w:rPr>
@@ -2998,7 +3046,7 @@
             <w:sz w:val="24"/>
             <w:szCs w:val="24"/>
           </w:rPr>
-          <w:id w:val="1972479287"/>
+          <w:id w:val="-1503112679"/>
           <w14:checkbox>
             <w14:checked w14:val="0"/>
             <w14:checkedState w14:val="2612" w14:font="MS Gothic"/>
@@ -3151,6 +3199,14 @@
         </w:rPr>
         <w:tab/>
       </w:r>
+      <w:r>
+        <w:rPr>
+          <w:rFonts w:ascii="Times New Roman" w:eastAsiaTheme="minorEastAsia" w:hAnsi="Times New Roman" w:cs="Times New Roman"/>
+          <w:sz w:val="24"/>
+          <w:szCs w:val="24"/>
+        </w:rPr>
+        <w:t xml:space="preserve">   </w:t>
+      </w:r>
       <w:sdt>
         <w:sdtPr>
           <w:rPr>
@@ -3158,7 +3214,7 @@
             <w:sz w:val="24"/>
             <w:szCs w:val="24"/>
           </w:rPr>
-          <w:id w:val="1528676757"/>
+          <w:id w:val="-1069728741"/>
           <w14:checkbox>
             <w14:checked w14:val="0"/>
             <w14:checkedState w14:val="2612" w14:font="MS Gothic"/>
@@ -3192,6 +3248,14 @@
         </w:rPr>
         <w:t xml:space="preserve"> </w:t>
       </w:r>
+      <w:r>
+        <w:rPr>
+          <w:rFonts w:ascii="Times New Roman" w:eastAsiaTheme="minorEastAsia" w:hAnsi="Times New Roman" w:cs="Times New Roman"/>
+          <w:sz w:val="24"/>
+          <w:szCs w:val="24"/>
+        </w:rPr>
+        <w:t xml:space="preserve"> </w:t>
+      </w:r>
       <w:sdt>
         <w:sdtPr>
           <w:rPr>
@@ -3199,7 +3263,7 @@
             <w:sz w:val="24"/>
             <w:szCs w:val="24"/>
           </w:rPr>
-          <w:id w:val="-395052438"/>
+          <w:id w:val="727270276"/>
           <w14:checkbox>
             <w14:checked w14:val="0"/>
             <w14:checkedState w14:val="2612" w14:font="MS Gothic"/>
@@ -3428,6 +3492,14 @@
         </w:rPr>
         <w:tab/>
       </w:r>
+      <w:r>
+        <w:rPr>
+          <w:rFonts w:ascii="Times New Roman" w:eastAsiaTheme="minorEastAsia" w:hAnsi="Times New Roman" w:cs="Times New Roman"/>
+          <w:sz w:val="24"/>
+          <w:szCs w:val="24"/>
+        </w:rPr>
+        <w:t xml:space="preserve">   </w:t>
+      </w:r>
       <w:sdt>
         <w:sdtPr>
           <w:rPr>
@@ -3435,7 +3507,7 @@
             <w:sz w:val="24"/>
             <w:szCs w:val="24"/>
           </w:rPr>
-          <w:id w:val="2047021164"/>
+          <w:id w:val="1344584810"/>
           <w14:checkbox>
             <w14:checked w14:val="0"/>
             <w14:checkedState w14:val="2612" w14:font="MS Gothic"/>
@@ -3469,6 +3541,14 @@
         </w:rPr>
         <w:t xml:space="preserve"> </w:t>
       </w:r>
+      <w:r>
+        <w:rPr>
+          <w:rFonts w:ascii="Times New Roman" w:eastAsiaTheme="minorEastAsia" w:hAnsi="Times New Roman" w:cs="Times New Roman"/>
+          <w:sz w:val="24"/>
+          <w:szCs w:val="24"/>
+        </w:rPr>
+        <w:t xml:space="preserve"> </w:t>
+      </w:r>
       <w:sdt>
         <w:sdtPr>
           <w:rPr>
@@ -3476,7 +3556,7 @@
             <w:sz w:val="24"/>
             <w:szCs w:val="24"/>
           </w:rPr>
-          <w:id w:val="1536153680"/>
+          <w:id w:val="-2058384789"/>
           <w14:checkbox>
             <w14:checked w14:val="0"/>
             <w14:checkedState w14:val="2612" w14:font="MS Gothic"/>
@@ -3674,6 +3754,14 @@
         </w:rPr>
         <w:tab/>
       </w:r>
+      <w:r>
+        <w:rPr>
+          <w:rFonts w:ascii="Times New Roman" w:eastAsiaTheme="minorEastAsia" w:hAnsi="Times New Roman" w:cs="Times New Roman"/>
+          <w:sz w:val="24"/>
+          <w:szCs w:val="24"/>
+        </w:rPr>
+        <w:t xml:space="preserve">   </w:t>
+      </w:r>
       <w:sdt>
         <w:sdtPr>
           <w:rPr>
@@ -3681,7 +3769,7 @@
             <w:sz w:val="24"/>
             <w:szCs w:val="24"/>
           </w:rPr>
-          <w:id w:val="197287862"/>
+          <w:id w:val="95529779"/>
           <w14:checkbox>
             <w14:checked w14:val="0"/>
             <w14:checkedState w14:val="2612" w14:font="MS Gothic"/>
@@ -3715,6 +3803,14 @@
         </w:rPr>
         <w:t xml:space="preserve"> </w:t>
       </w:r>
+      <w:r>
+        <w:rPr>
+          <w:rFonts w:ascii="Times New Roman" w:eastAsiaTheme="minorEastAsia" w:hAnsi="Times New Roman" w:cs="Times New Roman"/>
+          <w:sz w:val="24"/>
+          <w:szCs w:val="24"/>
+        </w:rPr>
+        <w:t xml:space="preserve"> </w:t>
+      </w:r>
       <w:sdt>
         <w:sdtPr>
           <w:rPr>
@@ -3722,7 +3818,7 @@
             <w:sz w:val="24"/>
             <w:szCs w:val="24"/>
           </w:rPr>
-          <w:id w:val="280846824"/>
+          <w:id w:val="888079474"/>
           <w14:checkbox>
             <w14:checked w14:val="0"/>
             <w14:checkedState w14:val="2612" w14:font="MS Gothic"/>
@@ -3887,6 +3983,14 @@
         </w:rPr>
         <w:tab/>
       </w:r>
+      <w:r>
+        <w:rPr>
+          <w:rFonts w:ascii="Times New Roman" w:eastAsiaTheme="minorEastAsia" w:hAnsi="Times New Roman" w:cs="Times New Roman"/>
+          <w:sz w:val="24"/>
+          <w:szCs w:val="24"/>
+        </w:rPr>
+        <w:t xml:space="preserve">   </w:t>
+      </w:r>
       <w:sdt>
         <w:sdtPr>
           <w:rPr>
@@ -3894,7 +3998,7 @@
             <w:sz w:val="24"/>
             <w:szCs w:val="24"/>
           </w:rPr>
-          <w:id w:val="-16396168"/>
+          <w:id w:val="-2053454035"/>
           <w14:checkbox>
             <w14:checked w14:val="0"/>
             <w14:checkedState w14:val="2612" w14:font="MS Gothic"/>
@@ -3928,6 +4032,14 @@
         </w:rPr>
         <w:t xml:space="preserve"> </w:t>
       </w:r>
+      <w:r>
+        <w:rPr>
+          <w:rFonts w:ascii="Times New Roman" w:eastAsiaTheme="minorEastAsia" w:hAnsi="Times New Roman" w:cs="Times New Roman"/>
+          <w:sz w:val="24"/>
+          <w:szCs w:val="24"/>
+        </w:rPr>
+        <w:t xml:space="preserve"> </w:t>
+      </w:r>
       <w:sdt>
         <w:sdtPr>
           <w:rPr>
@@ -3935,7 +4047,7 @@
             <w:sz w:val="24"/>
             <w:szCs w:val="24"/>
           </w:rPr>
-          <w:id w:val="-5140075"/>
+          <w:id w:val="2135830117"/>
           <w14:checkbox>
             <w14:checked w14:val="0"/>
             <w14:checkedState w14:val="2612" w14:font="MS Gothic"/>
@@ -4027,16 +4139,7 @@
                 <w:szCs w:val="24"/>
                 <w:lang w:eastAsia="de-DE"/>
               </w:rPr>
-              <m:t>f</m:t>
-            </m:r>
-            <m:r>
-              <w:rPr>
-                <w:rFonts w:ascii="Cambria Math" w:eastAsia="Times New Roman" w:hAnsi="Cambria Math" w:cs="Times New Roman"/>
-                <w:sz w:val="24"/>
-                <w:szCs w:val="24"/>
-                <w:lang w:eastAsia="de-DE"/>
-              </w:rPr>
-              <m:t>(x)</m:t>
+              <m:t>f(x)</m:t>
             </m:r>
             <m:r>
               <m:rPr>
@@ -4154,6 +4257,14 @@
         </w:rPr>
         <w:tab/>
       </w:r>
+      <w:r>
+        <w:rPr>
+          <w:rFonts w:ascii="Times New Roman" w:eastAsiaTheme="minorEastAsia" w:hAnsi="Times New Roman" w:cs="Times New Roman"/>
+          <w:sz w:val="24"/>
+          <w:szCs w:val="24"/>
+        </w:rPr>
+        <w:t xml:space="preserve">   </w:t>
+      </w:r>
       <w:sdt>
         <w:sdtPr>
           <w:rPr>
@@ -4161,7 +4272,7 @@
             <w:sz w:val="24"/>
             <w:szCs w:val="24"/>
           </w:rPr>
-          <w:id w:val="-1760355717"/>
+          <w:id w:val="-262232276"/>
           <w14:checkbox>
             <w14:checked w14:val="0"/>
             <w14:checkedState w14:val="2612" w14:font="MS Gothic"/>
@@ -4195,6 +4306,14 @@
         </w:rPr>
         <w:t xml:space="preserve"> </w:t>
       </w:r>
+      <w:r>
+        <w:rPr>
+          <w:rFonts w:ascii="Times New Roman" w:eastAsiaTheme="minorEastAsia" w:hAnsi="Times New Roman" w:cs="Times New Roman"/>
+          <w:sz w:val="24"/>
+          <w:szCs w:val="24"/>
+        </w:rPr>
+        <w:t xml:space="preserve"> </w:t>
+      </w:r>
       <w:sdt>
         <w:sdtPr>
           <w:rPr>
@@ -4202,7 +4321,7 @@
             <w:sz w:val="24"/>
             <w:szCs w:val="24"/>
           </w:rPr>
-          <w:id w:val="756563867"/>
+          <w:id w:val="-1600320614"/>
           <w14:checkbox>
             <w14:checked w14:val="0"/>
             <w14:checkedState w14:val="2612" w14:font="MS Gothic"/>
@@ -4396,6 +4515,14 @@
         </w:rPr>
         <w:tab/>
       </w:r>
+      <w:r>
+        <w:rPr>
+          <w:rFonts w:ascii="Times New Roman" w:eastAsiaTheme="minorEastAsia" w:hAnsi="Times New Roman" w:cs="Times New Roman"/>
+          <w:sz w:val="24"/>
+          <w:szCs w:val="24"/>
+        </w:rPr>
+        <w:t xml:space="preserve">   </w:t>
+      </w:r>
       <w:sdt>
         <w:sdtPr>
           <w:rPr>
@@ -4403,7 +4530,7 @@
             <w:sz w:val="24"/>
             <w:szCs w:val="24"/>
           </w:rPr>
-          <w:id w:val="-1984767950"/>
+          <w:id w:val="17280792"/>
           <w14:checkbox>
             <w14:checked w14:val="0"/>
             <w14:checkedState w14:val="2612" w14:font="MS Gothic"/>
@@ -4437,6 +4564,14 @@
         </w:rPr>
         <w:t xml:space="preserve"> </w:t>
       </w:r>
+      <w:r>
+        <w:rPr>
+          <w:rFonts w:ascii="Times New Roman" w:eastAsiaTheme="minorEastAsia" w:hAnsi="Times New Roman" w:cs="Times New Roman"/>
+          <w:sz w:val="24"/>
+          <w:szCs w:val="24"/>
+        </w:rPr>
+        <w:t xml:space="preserve"> </w:t>
+      </w:r>
       <w:sdt>
         <w:sdtPr>
           <w:rPr>
@@ -4444,7 +4579,7 @@
             <w:sz w:val="24"/>
             <w:szCs w:val="24"/>
           </w:rPr>
-          <w:id w:val="1428386423"/>
+          <w:id w:val="-1613047559"/>
           <w14:checkbox>
             <w14:checked w14:val="0"/>
             <w14:checkedState w14:val="2612" w14:font="MS Gothic"/>
@@ -5854,35 +5989,45 @@
                 </m:ctrlPr>
               </m:fPr>
               <m:num>
-                <m:r>
-                  <m:rPr>
-                    <m:sty m:val="p"/>
-                  </m:rPr>
-                  <w:rPr>
-                    <w:rFonts w:ascii="Cambria Math" w:hAnsi="Cambria Math" w:cs="Times New Roman"/>
-                    <w:sz w:val="24"/>
-                    <w:szCs w:val="24"/>
-                  </w:rPr>
-                  <m:t>sin⁡(</m:t>
-                </m:r>
+                <m:sSup>
+                  <m:sSupPr>
+                    <m:ctrlPr>
+                      <w:rPr>
+                        <w:rFonts w:ascii="Cambria Math" w:hAnsi="Cambria Math" w:cs="Times New Roman"/>
+                        <w:i/>
+                        <w:sz w:val="24"/>
+                        <w:szCs w:val="24"/>
+                      </w:rPr>
+                    </m:ctrlPr>
+                  </m:sSupPr>
+                  <m:e>
+                    <m:r>
+                      <w:rPr>
+                        <w:rFonts w:ascii="Cambria Math" w:hAnsi="Cambria Math" w:cs="Times New Roman"/>
+                        <w:sz w:val="24"/>
+                        <w:szCs w:val="24"/>
+                      </w:rPr>
+                      <m:t>x</m:t>
+                    </m:r>
+                  </m:e>
+                  <m:sup>
+                    <m:r>
+                      <w:rPr>
+                        <w:rFonts w:ascii="Cambria Math" w:hAnsi="Cambria Math" w:cs="Times New Roman"/>
+                        <w:sz w:val="24"/>
+                        <w:szCs w:val="24"/>
+                      </w:rPr>
+                      <m:t>2</m:t>
+                    </m:r>
+                  </m:sup>
+                </m:sSup>
                 <m:r>
                   <w:rPr>
                     <w:rFonts w:ascii="Cambria Math" w:hAnsi="Cambria Math" w:cs="Times New Roman"/>
                     <w:sz w:val="24"/>
                     <w:szCs w:val="24"/>
                   </w:rPr>
-                  <m:t>x</m:t>
-                </m:r>
-                <m:r>
-                  <m:rPr>
-                    <m:sty m:val="p"/>
-                  </m:rPr>
-                  <w:rPr>
-                    <w:rFonts w:ascii="Cambria Math" w:hAnsi="Cambria Math" w:cs="Times New Roman"/>
-                    <w:sz w:val="24"/>
-                    <w:szCs w:val="24"/>
-                  </w:rPr>
-                  <m:t>)</m:t>
+                  <m:t>+1</m:t>
                 </m:r>
               </m:num>
               <m:den>
@@ -5893,6 +6038,14 @@
                     <w:szCs w:val="24"/>
                   </w:rPr>
                   <m:t>x</m:t>
+                </m:r>
+                <m:r>
+                  <w:rPr>
+                    <w:rFonts w:ascii="Cambria Math" w:hAnsi="Cambria Math" w:cs="Times New Roman"/>
+                    <w:sz w:val="24"/>
+                    <w:szCs w:val="24"/>
+                  </w:rPr>
+                  <m:t>+1</m:t>
                 </m:r>
               </m:den>
             </m:f>
@@ -6106,6 +6259,7 @@
         <w:tabs>
           <w:tab w:val="left" w:pos="7088"/>
         </w:tabs>
+        <w:spacing w:line="360" w:lineRule="auto"/>
         <w:ind w:left="0"/>
         <w:rPr>
           <w:rFonts w:ascii="Times New Roman" w:hAnsi="Times New Roman" w:cs="Times New Roman"/>
@@ -6144,23 +6298,7 @@
             <w:sz w:val="24"/>
             <w:szCs w:val="24"/>
           </w:rPr>
-          <m:t>t</m:t>
-        </m:r>
-        <m:r>
-          <w:rPr>
-            <w:rFonts w:ascii="Cambria Math" w:hAnsi="Cambria Math" w:cs="Times New Roman"/>
-            <w:sz w:val="24"/>
-            <w:szCs w:val="24"/>
-          </w:rPr>
-          <m:t>≥</m:t>
-        </m:r>
-        <m:r>
-          <w:rPr>
-            <w:rFonts w:ascii="Cambria Math" w:hAnsi="Cambria Math" w:cs="Times New Roman"/>
-            <w:sz w:val="24"/>
-            <w:szCs w:val="24"/>
-          </w:rPr>
-          <m:t>0</m:t>
+          <m:t>t≥0</m:t>
         </m:r>
       </m:oMath>
       <w:r>
@@ -6358,6 +6496,14 @@
             </w:rPr>
             <m:t>.</m:t>
           </m:r>
+          <m:r>
+            <w:rPr>
+              <w:rFonts w:ascii="Times New Roman" w:eastAsiaTheme="minorEastAsia" w:hAnsi="Times New Roman" w:cs="Times New Roman"/>
+              <w:sz w:val="24"/>
+              <w:szCs w:val="24"/>
+            </w:rPr>
+            <w:br/>
+          </m:r>
         </m:oMath>
       </m:oMathPara>
     </w:p>
@@ -6400,7 +6546,33 @@
           <w:sz w:val="24"/>
           <w:szCs w:val="24"/>
         </w:rPr>
-        <w:t xml:space="preserve"> wird in Sekunden gemessen.</w:t>
+        <w:t xml:space="preserve"> wird in Sekunden gemessen</w:t>
+      </w:r>
+      <w:r>
+        <w:rPr>
+          <w:rFonts w:ascii="Times New Roman" w:hAnsi="Times New Roman" w:cs="Times New Roman"/>
+          <w:sz w:val="24"/>
+          <w:szCs w:val="24"/>
+        </w:rPr>
+        <w:t xml:space="preserve"> und der Ort </w:t>
+      </w:r>
+      <m:oMath>
+        <m:r>
+          <w:rPr>
+            <w:rFonts w:ascii="Cambria Math" w:hAnsi="Cambria Math" w:cs="Times New Roman"/>
+            <w:sz w:val="24"/>
+            <w:szCs w:val="24"/>
+          </w:rPr>
+          <m:t>s</m:t>
+        </m:r>
+      </m:oMath>
+      <w:r>
+        <w:rPr>
+          <w:rFonts w:ascii="Times New Roman" w:eastAsiaTheme="minorEastAsia" w:hAnsi="Times New Roman" w:cs="Times New Roman"/>
+          <w:sz w:val="24"/>
+          <w:szCs w:val="24"/>
+        </w:rPr>
+        <w:t xml:space="preserve"> in Metern.</w:t>
       </w:r>
     </w:p>
     <w:p>
@@ -6670,136 +6842,104 @@
             <w:sz w:val="24"/>
             <w:szCs w:val="24"/>
           </w:rPr>
-          <m:t>t</m:t>
+          <m:t>t=1</m:t>
         </m:r>
+      </m:oMath>
+      <w:r>
+        <w:rPr>
+          <w:rFonts w:ascii="Times New Roman" w:hAnsi="Times New Roman" w:cs="Times New Roman"/>
+          <w:sz w:val="24"/>
+          <w:szCs w:val="24"/>
+        </w:rPr>
+        <w:t xml:space="preserve">. </w:t>
+      </w:r>
+    </w:p>
+    <w:p>
+      <w:pPr>
+        <w:pStyle w:val="Listenabsatz"/>
+        <w:numPr>
+          <w:ilvl w:val="0"/>
+          <w:numId w:val="53"/>
+        </w:numPr>
+        <w:tabs>
+          <w:tab w:val="left" w:pos="7088"/>
+        </w:tabs>
+        <w:spacing w:after="120"/>
+        <w:contextualSpacing w:val="0"/>
+        <w:rPr>
+          <w:rFonts w:ascii="Times New Roman" w:hAnsi="Times New Roman" w:cs="Times New Roman"/>
+          <w:sz w:val="24"/>
+          <w:szCs w:val="24"/>
+        </w:rPr>
+      </w:pPr>
+      <w:r>
+        <w:rPr>
+          <w:rFonts w:ascii="Times New Roman" w:hAnsi="Times New Roman" w:cs="Times New Roman"/>
+          <w:sz w:val="24"/>
+          <w:szCs w:val="24"/>
+        </w:rPr>
+        <w:t>Skizzieren Sie die Bahnkurv</w:t>
+      </w:r>
+      <w:r>
+        <w:rPr>
+          <w:rFonts w:ascii="Times New Roman" w:hAnsi="Times New Roman" w:cs="Times New Roman"/>
+          <w:sz w:val="24"/>
+          <w:szCs w:val="24"/>
+        </w:rPr>
+        <w:t>e</w:t>
+      </w:r>
+      <w:r>
+        <w:rPr>
+          <w:rFonts w:ascii="Times New Roman" w:hAnsi="Times New Roman" w:cs="Times New Roman"/>
+          <w:sz w:val="24"/>
+          <w:szCs w:val="24"/>
+        </w:rPr>
+        <w:t>.</w:t>
+      </w:r>
+    </w:p>
+    <w:p>
+      <w:pPr>
+        <w:pStyle w:val="Listenabsatz"/>
+        <w:numPr>
+          <w:ilvl w:val="0"/>
+          <w:numId w:val="53"/>
+        </w:numPr>
+        <w:tabs>
+          <w:tab w:val="left" w:pos="7088"/>
+        </w:tabs>
+        <w:spacing w:after="120"/>
+        <w:contextualSpacing w:val="0"/>
+        <w:rPr>
+          <w:rFonts w:ascii="Times New Roman" w:hAnsi="Times New Roman" w:cs="Times New Roman"/>
+          <w:sz w:val="24"/>
+          <w:szCs w:val="24"/>
+        </w:rPr>
+      </w:pPr>
+      <w:r>
+        <w:rPr>
+          <w:rFonts w:ascii="Times New Roman" w:hAnsi="Times New Roman" w:cs="Times New Roman"/>
+          <w:sz w:val="24"/>
+          <w:szCs w:val="24"/>
+        </w:rPr>
+        <w:t xml:space="preserve">Zeichnen Sie den Geschwindigkeits- sowie Beschleunigungsvektor an der Stelle </w:t>
+      </w:r>
+      <w:r>
+        <w:rPr>
+          <w:rFonts w:ascii="Times New Roman" w:eastAsiaTheme="minorEastAsia" w:hAnsi="Times New Roman" w:cs="Times New Roman"/>
+          <w:sz w:val="24"/>
+          <w:szCs w:val="24"/>
+        </w:rPr>
+        <w:br/>
+      </w:r>
+      <m:oMath>
         <m:r>
           <w:rPr>
             <w:rFonts w:ascii="Cambria Math" w:hAnsi="Cambria Math" w:cs="Times New Roman"/>
             <w:sz w:val="24"/>
             <w:szCs w:val="24"/>
           </w:rPr>
-          <m:t>=</m:t>
+          <m:t>t=π/2</m:t>
         </m:r>
-        <m:r>
-          <w:rPr>
-            <w:rFonts w:ascii="Cambria Math" w:hAnsi="Cambria Math" w:cs="Times New Roman"/>
-            <w:sz w:val="24"/>
-            <w:szCs w:val="24"/>
-          </w:rPr>
-          <m:t>1</m:t>
-        </m:r>
-      </m:oMath>
-      <w:r>
-        <w:rPr>
-          <w:rFonts w:ascii="Times New Roman" w:hAnsi="Times New Roman" w:cs="Times New Roman"/>
-          <w:sz w:val="24"/>
-          <w:szCs w:val="24"/>
-        </w:rPr>
-        <w:t xml:space="preserve">. </w:t>
-      </w:r>
-    </w:p>
-    <w:p>
-      <w:pPr>
-        <w:pStyle w:val="Listenabsatz"/>
-        <w:numPr>
-          <w:ilvl w:val="0"/>
-          <w:numId w:val="53"/>
-        </w:numPr>
-        <w:tabs>
-          <w:tab w:val="left" w:pos="7088"/>
-        </w:tabs>
-        <w:spacing w:after="120"/>
-        <w:contextualSpacing w:val="0"/>
-        <w:rPr>
-          <w:rFonts w:ascii="Times New Roman" w:hAnsi="Times New Roman" w:cs="Times New Roman"/>
-          <w:sz w:val="24"/>
-          <w:szCs w:val="24"/>
-        </w:rPr>
-      </w:pPr>
-      <w:r>
-        <w:rPr>
-          <w:rFonts w:ascii="Times New Roman" w:hAnsi="Times New Roman" w:cs="Times New Roman"/>
-          <w:sz w:val="24"/>
-          <w:szCs w:val="24"/>
-        </w:rPr>
-        <w:t>Skizzieren Sie die Bahnkurv</w:t>
-      </w:r>
-      <w:r>
-        <w:rPr>
-          <w:rFonts w:ascii="Times New Roman" w:hAnsi="Times New Roman" w:cs="Times New Roman"/>
-          <w:sz w:val="24"/>
-          <w:szCs w:val="24"/>
-        </w:rPr>
-        <w:t>e</w:t>
-      </w:r>
-      <w:r>
-        <w:rPr>
-          <w:rFonts w:ascii="Times New Roman" w:hAnsi="Times New Roman" w:cs="Times New Roman"/>
-          <w:sz w:val="24"/>
-          <w:szCs w:val="24"/>
-        </w:rPr>
-        <w:t>.</w:t>
-      </w:r>
-    </w:p>
-    <w:p>
-      <w:pPr>
-        <w:pStyle w:val="Listenabsatz"/>
-        <w:numPr>
-          <w:ilvl w:val="0"/>
-          <w:numId w:val="53"/>
-        </w:numPr>
-        <w:tabs>
-          <w:tab w:val="left" w:pos="7088"/>
-        </w:tabs>
-        <w:spacing w:after="120"/>
-        <w:contextualSpacing w:val="0"/>
-        <w:rPr>
-          <w:rFonts w:ascii="Times New Roman" w:hAnsi="Times New Roman" w:cs="Times New Roman"/>
-          <w:sz w:val="24"/>
-          <w:szCs w:val="24"/>
-        </w:rPr>
-      </w:pPr>
-      <w:r>
-        <w:rPr>
-          <w:rFonts w:ascii="Times New Roman" w:hAnsi="Times New Roman" w:cs="Times New Roman"/>
-          <w:sz w:val="24"/>
-          <w:szCs w:val="24"/>
-        </w:rPr>
-        <w:t xml:space="preserve">Zeichnen Sie den Geschwindigkeits- sowie Beschleunigungsvektor an der Stelle </w:t>
-      </w:r>
-      <m:oMath>
-        <m:f>
-          <m:fPr>
-            <m:ctrlPr>
-              <w:rPr>
-                <w:rFonts w:ascii="Cambria Math" w:hAnsi="Cambria Math" w:cs="Times New Roman"/>
-                <w:i/>
-                <w:sz w:val="24"/>
-                <w:szCs w:val="24"/>
-              </w:rPr>
-            </m:ctrlPr>
-          </m:fPr>
-          <m:num>
-            <m:r>
-              <w:rPr>
-                <w:rFonts w:ascii="Cambria Math" w:hAnsi="Cambria Math" w:cs="Times New Roman"/>
-                <w:sz w:val="24"/>
-                <w:szCs w:val="24"/>
-              </w:rPr>
-              <m:t>π</m:t>
-            </m:r>
-          </m:num>
-          <m:den>
-            <m:r>
-              <w:rPr>
-                <w:rFonts w:ascii="Cambria Math" w:hAnsi="Cambria Math" w:cs="Times New Roman"/>
-                <w:sz w:val="24"/>
-                <w:szCs w:val="24"/>
-              </w:rPr>
-              <m:t>2</m:t>
-            </m:r>
-          </m:den>
-        </m:f>
         <m:r>
           <w:rPr>
             <w:rFonts w:ascii="Cambria Math" w:hAnsi="Cambria Math" w:cs="Times New Roman"/>
@@ -8445,15 +8585,7 @@
             <w:sz w:val="24"/>
             <w:szCs w:val="24"/>
           </w:rPr>
-          <m:t>t</m:t>
-        </m:r>
-        <m:r>
-          <w:rPr>
-            <w:rFonts w:ascii="Cambria Math" w:hAnsi="Cambria Math" w:cs="Times New Roman"/>
-            <w:sz w:val="24"/>
-            <w:szCs w:val="24"/>
-          </w:rPr>
-          <m:t>=0</m:t>
+          <m:t>t=0</m:t>
         </m:r>
       </m:oMath>
       <w:r>
@@ -9287,15 +9419,7 @@
                   <w:sz w:val="24"/>
                   <w:szCs w:val="24"/>
                 </w:rPr>
-                <m:t>θ=</m:t>
-              </m:r>
-              <m:r>
-                <w:rPr>
-                  <w:rFonts w:ascii="Cambria Math" w:hAnsi="Cambria Math" w:cs="Times New Roman"/>
-                  <w:sz w:val="24"/>
-                  <w:szCs w:val="24"/>
-                </w:rPr>
-                <m:t>0</m:t>
+                <m:t>θ=0</m:t>
               </m:r>
             </m:sub>
             <m:sup>
@@ -9328,15 +9452,7 @@
                       <w:sz w:val="24"/>
                       <w:szCs w:val="24"/>
                     </w:rPr>
-                    <m:t>φ=</m:t>
-                  </m:r>
-                  <m:r>
-                    <w:rPr>
-                      <w:rFonts w:ascii="Cambria Math" w:hAnsi="Cambria Math" w:cs="Times New Roman"/>
-                      <w:sz w:val="24"/>
-                      <w:szCs w:val="24"/>
-                    </w:rPr>
-                    <m:t>0</m:t>
+                    <m:t>φ=0</m:t>
                   </m:r>
                 </m:sub>
                 <m:sup>
@@ -9369,15 +9485,7 @@
                           <w:sz w:val="24"/>
                           <w:szCs w:val="24"/>
                         </w:rPr>
-                        <m:t>r=</m:t>
-                      </m:r>
-                      <m:r>
-                        <w:rPr>
-                          <w:rFonts w:ascii="Cambria Math" w:hAnsi="Cambria Math" w:cs="Times New Roman"/>
-                          <w:sz w:val="24"/>
-                          <w:szCs w:val="24"/>
-                        </w:rPr>
-                        <m:t>0</m:t>
+                        <m:t>r=0</m:t>
                       </m:r>
                     </m:sub>
                     <m:sup>
@@ -9478,15 +9586,7 @@
                           <w:sz w:val="24"/>
                           <w:szCs w:val="24"/>
                         </w:rPr>
-                        <m:t xml:space="preserve"> </m:t>
-                      </m:r>
-                      <m:r>
-                        <w:rPr>
-                          <w:rFonts w:ascii="Cambria Math" w:hAnsi="Cambria Math" w:cs="Times New Roman"/>
-                          <w:sz w:val="24"/>
-                          <w:szCs w:val="24"/>
-                        </w:rPr>
-                        <m:t>ⅆrⅆθⅆφ</m:t>
+                        <m:t xml:space="preserve"> ⅆrⅆθⅆφ</m:t>
                       </m:r>
                     </m:e>
                   </m:nary>
@@ -16289,6 +16389,7 @@
   <w:style w:type="character" w:default="1" w:styleId="Absatz-Standardschriftart">
     <w:name w:val="Default Paragraph Font"/>
     <w:uiPriority w:val="1"/>
+    <w:semiHidden/>
     <w:unhideWhenUsed/>
   </w:style>
   <w:style w:type="table" w:default="1" w:styleId="NormaleTabelle">

</xml_diff>